<commit_message>
docs: incorporate latest main progress into academic compendium
</commit_message>
<xml_diff>
--- a/informe-academico.docx
+++ b/informe-academico.docx
@@ -85,12 +85,12 @@
     </w:p>
     <w:p>
       <w:r>
-        <w:t>Sumatoria es un sistema en evolución para apoyar la gestión de proyectos de arquitectura y construcción. En los checkouts locales consultados hay una interfaz React/Tauri, un backend Node.js/Fastify y un modelo relacional PostgreSQL versionado. El código integrado contiene rutas de proyectos y una implementación de validación OIDC con resolución de identidad externa. La madurez funcional varía entre módulos; el catálogo de producto no se trata como evidencia de que todos sus recorridos estén disponibles.</w:t>
+        <w:t>Al corte del 15 de octubre de 2026, los repositorios fuente están actualizados en main: el código integrado reúne React/Tauri, una API Node.js/Fastify, PostgreSQL, inicio de sesión de escritorio con Google OAuth e Identity Platform, y creación de proyectos asociada a Database 2.2.3. La madurez varía por módulo; la integración en main no acredita despliegue ni que todos los recorridos estén disponibles.</w:t>
       </w:r>
     </w:p>
     <w:p>
       <w:r>
-        <w:t>La documentación registra un gate formal de migración arquitectónica como PASS/CLOSED el 1 de octubre de 2026, un conjunto de pruebas de base de datos local y un resultado HTTP 200 para una lectura de proyecto con identidad real en STAGING el 3 de octubre. El resultado de STAGING fue informado por el owner y quedó documentado; no se reejecutó para este informe. El gate de migración y el backlog posterior tienen alcances distintos: el checklist de main revisado el 3 de octubre conserva 33 tareas pendientes y 6 en curso de 39.</w:t>
+        <w:t>Los registros documentan 251 pruebas de regresión post-migración y gates locales para Database 2.2.3 y sus rutas. Database 2.2.3 sigue como candidata y no consta desplegada. El HTTP 200 en STAGING del 3 de octubre corresponde a una lectura acotada sobre el estado documentado entonces, no a la nueva creación de proyectos. La documentación ahora enlaza 21 frentes globales con 39 fichas; esa reorganización mejora la trazabilidad, pero no indica que las tareas estén cerradas.</w:t>
       </w:r>
     </w:p>
     <w:p>
@@ -3354,7 +3354,7 @@
     </w:p>
     <w:p>
       <w:r>
-        <w:t>Registros posteriores describen migraciones forward hasta V2.2.2 y runtime de staging. Otros README del modelo siguen presentando el corte anterior y dicen que Cloud SQL no estaba desplegado. La lectura más prudente es temporal: V2.2.0 tiene release local documentado; V2.2.2 en STAGING aparece en registros posteriores; el estado actual de GCP no fue comprobado. El compendio no publica SQL ni configuraciones.</w:t>
+        <w:t>Registros anteriores describen migraciones forward hasta V2.2.2 y una validación en STAGING. El corte actualizado de 15-10-2026 incorpora Database 2.2.3 en main como candidata validada localmente, sin despliegue documentado. Los README del modelo que describen cortes anteriores se leen con su fecha. El estado actual de GCP no fue comprobado y este compendio no publica SQL ni configuraciones.</w:t>
       </w:r>
     </w:p>
     <w:tbl>
@@ -5611,7 +5611,7 @@
     </w:p>
     <w:p>
       <w:r>
-        <w:t>No se consultaron referencias remotas en vivo: la consulta de solo lectura falló por resolución de github.com. Las ramas no integradas se describen en el anexo de procedencia y no se atribuyen a main.</w:t>
+        <w:t>En la actualización del 15-10-2026 se consultó GitHub y se actualizaron por fast-forward las referencias main de ambos repositorios fuente. El informe inicial describía el snapshot anterior; para el estado vigente de main, véase la actualización de este documento. No se obtuvo un inventario completo de ramas remotas y no se atribuyen a main cambios de otras ramas.</w:t>
       </w:r>
     </w:p>
     <w:p>
@@ -6330,6 +6330,265 @@
         <w:spacing w:after="0" w:before="0" w:line="20" w:lineRule="exact"/>
       </w:pPr>
     </w:p>
+    <w:p>
+      <w:pPr>
+        <w:pStyle w:val="Heading1"/>
+        <w:keepNext/>
+      </w:pPr>
+      <w:r>
+        <w:t>Actualización del estado integrado en main</w:t>
+      </w:r>
+    </w:p>
+    <w:p>
+      <w:pPr>
+        <w:pStyle w:val="Subtitle"/>
+        <w:keepNext/>
+      </w:pPr>
+      <w:r>
+        <w:t>Corte de revisión: 15 de octubre de 2026</w:t>
+      </w:r>
+    </w:p>
+    <w:p>
+      <w:r>
+        <w:t>Después de la primera versión de este informe, se consultaron las referencias remotas y se actualizaron por fast-forward los repositorios fuente. Esta actualización resume los cambios que ahora forman parte de main y precisa su alcance. Complementa el snapshot anterior; cuando aquel describía referencias remotas sin verificar, prevalecen aquí las referencias observadas en esta fecha.</w:t>
+      </w:r>
+    </w:p>
+    <w:p>
+      <w:pPr>
+        <w:pStyle w:val="Heading2"/>
+      </w:pPr>
+      <w:r>
+        <w:t>Cambios integrados</w:t>
+      </w:r>
+    </w:p>
+    <w:tbl>
+      <w:tblPr>
+        <w:tblStyle w:val="LightShading"/>
+        <w:tblW w:type="auto" w:w="0"/>
+        <w:tblLook w:firstColumn="1" w:firstRow="1" w:lastColumn="0" w:lastRow="0" w:noHBand="0" w:noVBand="1" w:val="04A0"/>
+      </w:tblPr>
+      <w:tblGrid>
+        <w:gridCol w:w="3293"/>
+        <w:gridCol w:w="3293"/>
+        <w:gridCol w:w="3293"/>
+      </w:tblGrid>
+      <w:tr>
+        <w:tc>
+          <w:tcPr>
+            <w:tcW w:type="dxa" w:w="3293"/>
+          </w:tcPr>
+          <w:p>
+            <w:pPr>
+              <w:keepLines/>
+            </w:pPr>
+            <w:r>
+              <w:rPr>
+                <w:b/>
+                <w:sz w:val="18"/>
+              </w:rPr>
+              <w:t>Repositorio y referencia</w:t>
+            </w:r>
+          </w:p>
+        </w:tc>
+        <w:tc>
+          <w:tcPr>
+            <w:tcW w:type="dxa" w:w="3293"/>
+          </w:tcPr>
+          <w:p>
+            <w:pPr>
+              <w:keepLines/>
+            </w:pPr>
+            <w:r>
+              <w:rPr>
+                <w:b/>
+                <w:sz w:val="18"/>
+              </w:rPr>
+              <w:t>Evolución incorporada</w:t>
+            </w:r>
+          </w:p>
+        </w:tc>
+        <w:tc>
+          <w:tcPr>
+            <w:tcW w:type="dxa" w:w="3293"/>
+          </w:tcPr>
+          <w:p>
+            <w:pPr>
+              <w:keepLines/>
+            </w:pPr>
+            <w:r>
+              <w:rPr>
+                <w:b/>
+                <w:sz w:val="18"/>
+              </w:rPr>
+              <w:t>Estado y límite</w:t>
+            </w:r>
+          </w:p>
+        </w:tc>
+      </w:tr>
+      <w:tr>
+        <w:tc>
+          <w:tcPr>
+            <w:tcW w:type="dxa" w:w="3293"/>
+          </w:tcPr>
+          <w:p>
+            <w:pPr>
+              <w:keepLines/>
+              <w:spacing w:after="60"/>
+            </w:pPr>
+            <w:r>
+              <w:rPr>
+                <w:sz w:val="18"/>
+              </w:rPr>
+              <w:t>PR-SUM-CO-PC · main · ceb973b</w:t>
+            </w:r>
+          </w:p>
+        </w:tc>
+        <w:tc>
+          <w:tcPr>
+            <w:tcW w:type="dxa" w:w="3293"/>
+          </w:tcPr>
+          <w:p>
+            <w:pPr>
+              <w:keepLines/>
+              <w:spacing w:after="60"/>
+            </w:pPr>
+            <w:r>
+              <w:rPr>
+                <w:sz w:val="18"/>
+              </w:rPr>
+              <w:t>13 commits desde el corte local anterior. Integración del inicio de sesión Google para escritorio con PKCE e Identity Platform; ampliación de regresión frontend y backend; creación delegada de proyectos sobre Database 2.2.3.</w:t>
+            </w:r>
+          </w:p>
+        </w:tc>
+        <w:tc>
+          <w:tcPr>
+            <w:tcW w:type="dxa" w:w="3293"/>
+          </w:tcPr>
+          <w:p>
+            <w:pPr>
+              <w:keepLines/>
+              <w:spacing w:after="60"/>
+            </w:pPr>
+            <w:r>
+              <w:rPr>
+                <w:sz w:val="18"/>
+              </w:rPr>
+              <w:t>Código integrado. La autenticación de escritorio no acredita por sí sola empaquetado o distribución. Database 2.2.3 sigue como candidata y no consta desplegada.</w:t>
+            </w:r>
+          </w:p>
+        </w:tc>
+      </w:tr>
+      <w:tr>
+        <w:tc>
+          <w:tcPr>
+            <w:tcW w:type="dxa" w:w="3293"/>
+          </w:tcPr>
+          <w:p>
+            <w:pPr>
+              <w:keepLines/>
+              <w:spacing w:after="60"/>
+            </w:pPr>
+            <w:r>
+              <w:rPr>
+                <w:sz w:val="18"/>
+              </w:rPr>
+              <w:t>PR-SUM-CO-DOCS · main · cd46933</w:t>
+            </w:r>
+          </w:p>
+        </w:tc>
+        <w:tc>
+          <w:tcPr>
+            <w:tcW w:type="dxa" w:w="3293"/>
+          </w:tcPr>
+          <w:p>
+            <w:r>
+              <w:t>28 commits desde el corte anterior. Backlog global con 21 frentes, 39 fichas enlazadas, criterios de aceptación, trazabilidad y logs fechados; incluye el checkpoint Database 2.2.3.</w:t>
+            </w:r>
+          </w:p>
+        </w:tc>
+        <w:tc>
+          <w:tcPr>
+            <w:tcW w:type="dxa" w:w="3293"/>
+          </w:tcPr>
+          <w:p>
+            <w:pPr>
+              <w:keepLines/>
+              <w:spacing w:after="60"/>
+            </w:pPr>
+            <w:r>
+              <w:rPr>
+                <w:sz w:val="18"/>
+              </w:rPr>
+              <w:t>La reorganización facilita seguir el avance, pero no cambia automáticamente estados ni equivale a cerrar tareas. Se excluyeron asignaciones personales, prompts y reglas internas.</w:t>
+            </w:r>
+          </w:p>
+        </w:tc>
+      </w:tr>
+    </w:tbl>
+    <w:p>
+      <w:pPr>
+        <w:pStyle w:val="Heading2"/>
+      </w:pPr>
+      <w:r>
+        <w:t>Validaciones registradas y alcance</w:t>
+      </w:r>
+    </w:p>
+    <w:p>
+      <w:pPr>
+        <w:pStyle w:val="ListBullet"/>
+      </w:pPr>
+      <w:r>
+        <w:rPr>
+          <w:b/>
+        </w:rPr>
+        <w:t xml:space="preserve">Database 2.2.3 y rutas de proyecto. </w:t>
+      </w:r>
+      <w:r>
+        <w:t>El checkpoint de DOCS informa validación local en PostgreSQL 16.15, 16 pruebas T01–T16 aprobadas y regresión HTTP de lectura 6/6. El registro de ejecución también comunica POST, LIST y GET, 208/208 en test:foundation, typecheck y build aprobados. Son resultados documentados, no repetidos para esta edición. No se desplegó a STAGING, Cloud SQL o producción y no consta autorización productiva para crear proyectos.</w:t>
+      </w:r>
+    </w:p>
+    <w:p>
+      <w:pPr>
+        <w:pStyle w:val="ListBullet"/>
+      </w:pPr>
+      <w:r>
+        <w:rPr>
+          <w:b/>
+        </w:rPr>
+        <w:t xml:space="preserve">Regresión frontend. </w:t>
+      </w:r>
+      <w:r>
+        <w:t>Los registros del 12 de octubre informan 251 pruebas y validaciones complementarias de build, lint, typecheck y flujo PDF. El ciclo aún figuraba pendiente de revisión final. Este conteo tiene alcance propio y no se suma a los conteos de otros gates.</w:t>
+      </w:r>
+    </w:p>
+    <w:p>
+      <w:pPr>
+        <w:pStyle w:val="ListBullet"/>
+      </w:pPr>
+      <w:r>
+        <w:rPr>
+          <w:b/>
+        </w:rPr>
+        <w:t xml:space="preserve">Autenticación de escritorio. </w:t>
+      </w:r>
+      <w:r>
+        <w:t>El código integrado implementa el flujo nativo Google OAuth con PKCE, intercambio con Identity Platform y sesión en memoria del runtime Tauri. Los registros documentan validación del flujo; no se verificó en esta revisión una distribución firmada ni la configuración activa.</w:t>
+      </w:r>
+    </w:p>
+    <w:p>
+      <w:pPr>
+        <w:pStyle w:val="ListBullet"/>
+      </w:pPr>
+      <w:r>
+        <w:rPr>
+          <w:b/>
+        </w:rPr>
+        <w:t xml:space="preserve">STAGING. </w:t>
+      </w:r>
+      <w:r>
+        <w:t>El resultado HTTP 200 documentado el 3 de octubre sigue referido a una lectura de proyecto con identidad real sobre el estado registrado entonces. No acredita escritura, la nueva creación de proyectos ni el estado actual de GCP.</w:t>
+      </w:r>
+    </w:p>
     <w:sectPr>
       <w:headerReference w:type="default" r:id="rId9"/>
       <w:footerReference w:type="default" r:id="rId10"/>

</xml_diff>